<commit_message>
Cite the national footprint benchmarks, finalise the AI declaration, and version Appendix B
- Appendix A: cite Eurostat FIGARO (env_ac_ghgfp, 57.4 Mt, checked against the
  bronze extract) and Statistics Denmark AFTRYK1 (62.9 Mt, checked against
  StatBank) where the national footprints are compared; list renumbered.
- Manuscript: the AI declaration follows Elsevier's template and keeps the
  substance of the authors' original statement (Microsoft Copilot and Claude).
- Appendix B, the travel calculations workbook, is force-added so the deliverable
  is versioned despite the global *.xlsx ignore.
- docs/eriksen_et_al_2026/readme.md rewritten for co-authors: where to start,
  what to submit and not submit, what is versioned, how the letter is built;
  the documentation indexes point to it and to the 14 September findings.
</commit_message>
<xml_diff>
--- a/docs/eriksen_et_al_2026/eriksen_et_al_2026_supplementary_appendix_a.docx
+++ b/docs/eriksen_et_al_2026/eriksen_et_al_2026_supplementary_appendix_a.docx
@@ -34634,7 +34634,7 @@
             <w:szCs w:val="20"/>
             <w:lang w:val="en-GB"/>
           </w:rPr>
-          <w:t xml:space="preserve">The Danish national consumption-based climate footprint computed in this study, 77.2 Mt CO₂e for 2022, is higher than Eurostat FIGARO's 57.4 Mt, Statistics Denmark's AFTRYK 62.9 Mt, and Schmidt and Merciai's EXIOBASE-based 73.9 Mt for 2016 </w:t>
+          <w:t xml:space="preserve">The Danish national consumption-based climate footprint computed in this study, 77.2 Mt CO₂e for 2022, is higher than Eurostat FIGARO's 57.4 Mt [32], Statistics Denmark's AFTRYK 62.9 Mt [33], and Schmidt and Merciai's EXIOBASE-based 73.9 Mt for 2016 </w:t>
         </w:r>
       </w:ins>
       <w:ins w:id="16112" w:author="Albert Kwame Osei-Owusu" w:date="2026-09-14T09:00:00Z">
@@ -34646,7 +34646,7 @@
             <w:highlight w:val="yellow"/>
             <w:lang w:val="en-GB"/>
           </w:rPr>
-          <w:t xml:space="preserve">[32]</w:t>
+          <w:t xml:space="preserve">[34]</w:t>
         </w:r>
       </w:ins>
       <w:ins w:id="16113" w:author="Albert Kwame Osei-Owusu" w:date="2026-09-14T09:00:00Z">
@@ -35476,14 +35476,14 @@
         <w:spacing w:after="60" w:line="240" w:lineRule="auto"/>
         <w:ind w:left="567" w:hanging="567"/>
         <w:rPr>
-          <w:ins w:id="36357" w:author="Albert Kwame Osei-Owusu" w:date="2026-09-14T09:00:00Z"/>
+          <w:ins w:id="117762" w:author="Albert Kwame Osei-Owusu" w:date="2026-09-14T09:00:00Z"/>
           <w:rFonts w:ascii="Times New Roman" w:hAnsi="Times New Roman" w:cs="Times New Roman"/>
           <w:sz w:val="20"/>
           <w:szCs w:val="20"/>
           <w:lang w:val="en-GB"/>
         </w:rPr>
       </w:pPr>
-      <w:ins w:id="36358" w:author="Albert Kwame Osei-Owusu" w:date="2026-09-14T09:00:00Z">
+      <w:ins w:id="117763" w:author="Albert Kwame Osei-Owusu" w:date="2026-09-14T09:00:00Z">
         <w:r>
           <w:rPr>
             <w:rFonts w:ascii="Times New Roman" w:hAnsi="Times New Roman" w:cs="Times New Roman"/>
@@ -35513,7 +35513,7 @@
         </w:r>
       </w:ins>
       <w:hyperlink r:id="rIdRef1" w:history="1">
-        <w:ins w:id="36359" w:author="Albert Kwame Osei-Owusu" w:date="2026-09-14T09:00:00Z">
+        <w:ins w:id="117764" w:author="Albert Kwame Osei-Owusu" w:date="2026-09-14T09:00:00Z">
           <w:r>
             <w:rPr>
               <w:rStyle w:val="Hyperlink"/>
@@ -35526,7 +35526,7 @@
           </w:r>
         </w:ins>
       </w:hyperlink>
-      <w:ins w:id="36360" w:author="Albert Kwame Osei-Owusu" w:date="2026-09-14T09:00:00Z">
+      <w:ins w:id="117765" w:author="Albert Kwame Osei-Owusu" w:date="2026-09-14T09:00:00Z">
         <w:r>
           <w:rPr>
             <w:rFonts w:ascii="Times New Roman" w:hAnsi="Times New Roman" w:cs="Times New Roman"/>
@@ -35543,14 +35543,14 @@
         <w:spacing w:after="60" w:line="240" w:lineRule="auto"/>
         <w:ind w:left="567" w:hanging="567"/>
         <w:rPr>
-          <w:ins w:id="36361" w:author="Albert Kwame Osei-Owusu" w:date="2026-09-14T09:00:00Z"/>
+          <w:ins w:id="117766" w:author="Albert Kwame Osei-Owusu" w:date="2026-09-14T09:00:00Z"/>
           <w:rFonts w:ascii="Times New Roman" w:hAnsi="Times New Roman" w:cs="Times New Roman"/>
           <w:sz w:val="20"/>
           <w:szCs w:val="20"/>
           <w:lang w:val="en-GB"/>
         </w:rPr>
       </w:pPr>
-      <w:ins w:id="36362" w:author="Albert Kwame Osei-Owusu" w:date="2026-09-14T09:00:00Z">
+      <w:ins w:id="117767" w:author="Albert Kwame Osei-Owusu" w:date="2026-09-14T09:00:00Z">
         <w:r>
           <w:rPr>
             <w:rFonts w:ascii="Times New Roman" w:hAnsi="Times New Roman" w:cs="Times New Roman"/>
@@ -35580,7 +35580,7 @@
         </w:r>
       </w:ins>
       <w:hyperlink r:id="rIdRef2" w:history="1">
-        <w:ins w:id="36363" w:author="Albert Kwame Osei-Owusu" w:date="2026-09-14T09:00:00Z">
+        <w:ins w:id="117768" w:author="Albert Kwame Osei-Owusu" w:date="2026-09-14T09:00:00Z">
           <w:r>
             <w:rPr>
               <w:rStyle w:val="Hyperlink"/>
@@ -35593,7 +35593,7 @@
           </w:r>
         </w:ins>
       </w:hyperlink>
-      <w:ins w:id="36364" w:author="Albert Kwame Osei-Owusu" w:date="2026-09-14T09:00:00Z">
+      <w:ins w:id="117769" w:author="Albert Kwame Osei-Owusu" w:date="2026-09-14T09:00:00Z">
         <w:r>
           <w:rPr>
             <w:rFonts w:ascii="Times New Roman" w:hAnsi="Times New Roman" w:cs="Times New Roman"/>
@@ -35610,14 +35610,14 @@
         <w:spacing w:after="60" w:line="240" w:lineRule="auto"/>
         <w:ind w:left="567" w:hanging="567"/>
         <w:rPr>
-          <w:ins w:id="36365" w:author="Albert Kwame Osei-Owusu" w:date="2026-09-14T09:00:00Z"/>
+          <w:ins w:id="117770" w:author="Albert Kwame Osei-Owusu" w:date="2026-09-14T09:00:00Z"/>
           <w:rFonts w:ascii="Times New Roman" w:hAnsi="Times New Roman" w:cs="Times New Roman"/>
           <w:sz w:val="20"/>
           <w:szCs w:val="20"/>
           <w:lang w:val="en-GB"/>
         </w:rPr>
       </w:pPr>
-      <w:ins w:id="36366" w:author="Albert Kwame Osei-Owusu" w:date="2026-09-14T09:00:00Z">
+      <w:ins w:id="117771" w:author="Albert Kwame Osei-Owusu" w:date="2026-09-14T09:00:00Z">
         <w:r>
           <w:rPr>
             <w:rFonts w:ascii="Times New Roman" w:hAnsi="Times New Roman" w:cs="Times New Roman"/>
@@ -35647,7 +35647,7 @@
         </w:r>
       </w:ins>
       <w:hyperlink r:id="rIdRef3" w:history="1">
-        <w:ins w:id="36367" w:author="Albert Kwame Osei-Owusu" w:date="2026-09-14T09:00:00Z">
+        <w:ins w:id="117772" w:author="Albert Kwame Osei-Owusu" w:date="2026-09-14T09:00:00Z">
           <w:r>
             <w:rPr>
               <w:rStyle w:val="Hyperlink"/>
@@ -35660,7 +35660,7 @@
           </w:r>
         </w:ins>
       </w:hyperlink>
-      <w:ins w:id="36368" w:author="Albert Kwame Osei-Owusu" w:date="2026-09-14T09:00:00Z">
+      <w:ins w:id="117773" w:author="Albert Kwame Osei-Owusu" w:date="2026-09-14T09:00:00Z">
         <w:r>
           <w:rPr>
             <w:rFonts w:ascii="Times New Roman" w:hAnsi="Times New Roman" w:cs="Times New Roman"/>
@@ -35677,14 +35677,14 @@
         <w:spacing w:after="60" w:line="240" w:lineRule="auto"/>
         <w:ind w:left="567" w:hanging="567"/>
         <w:rPr>
-          <w:ins w:id="36369" w:author="Albert Kwame Osei-Owusu" w:date="2026-09-14T09:00:00Z"/>
+          <w:ins w:id="117774" w:author="Albert Kwame Osei-Owusu" w:date="2026-09-14T09:00:00Z"/>
           <w:rFonts w:ascii="Times New Roman" w:hAnsi="Times New Roman" w:cs="Times New Roman"/>
           <w:sz w:val="20"/>
           <w:szCs w:val="20"/>
           <w:lang w:val="en-GB"/>
         </w:rPr>
       </w:pPr>
-      <w:ins w:id="36370" w:author="Albert Kwame Osei-Owusu" w:date="2026-09-14T09:00:00Z">
+      <w:ins w:id="117775" w:author="Albert Kwame Osei-Owusu" w:date="2026-09-14T09:00:00Z">
         <w:r>
           <w:rPr>
             <w:rFonts w:ascii="Times New Roman" w:hAnsi="Times New Roman" w:cs="Times New Roman"/>
@@ -35714,7 +35714,7 @@
         </w:r>
       </w:ins>
       <w:hyperlink r:id="rIdRef4" w:history="1">
-        <w:ins w:id="36371" w:author="Albert Kwame Osei-Owusu" w:date="2026-09-14T09:00:00Z">
+        <w:ins w:id="117776" w:author="Albert Kwame Osei-Owusu" w:date="2026-09-14T09:00:00Z">
           <w:r>
             <w:rPr>
               <w:rStyle w:val="Hyperlink"/>
@@ -35727,7 +35727,7 @@
           </w:r>
         </w:ins>
       </w:hyperlink>
-      <w:ins w:id="36372" w:author="Albert Kwame Osei-Owusu" w:date="2026-09-14T09:00:00Z">
+      <w:ins w:id="117777" w:author="Albert Kwame Osei-Owusu" w:date="2026-09-14T09:00:00Z">
         <w:r>
           <w:rPr>
             <w:rFonts w:ascii="Times New Roman" w:hAnsi="Times New Roman" w:cs="Times New Roman"/>
@@ -35744,14 +35744,14 @@
         <w:spacing w:after="60" w:line="240" w:lineRule="auto"/>
         <w:ind w:left="567" w:hanging="567"/>
         <w:rPr>
-          <w:ins w:id="36373" w:author="Albert Kwame Osei-Owusu" w:date="2026-09-14T09:00:00Z"/>
+          <w:ins w:id="117778" w:author="Albert Kwame Osei-Owusu" w:date="2026-09-14T09:00:00Z"/>
           <w:rFonts w:ascii="Times New Roman" w:hAnsi="Times New Roman" w:cs="Times New Roman"/>
           <w:sz w:val="20"/>
           <w:szCs w:val="20"/>
           <w:lang w:val="en-GB"/>
         </w:rPr>
       </w:pPr>
-      <w:ins w:id="36374" w:author="Albert Kwame Osei-Owusu" w:date="2026-09-14T09:00:00Z">
+      <w:ins w:id="117779" w:author="Albert Kwame Osei-Owusu" w:date="2026-09-14T09:00:00Z">
         <w:r>
           <w:rPr>
             <w:rFonts w:ascii="Times New Roman" w:hAnsi="Times New Roman" w:cs="Times New Roman"/>
@@ -35781,7 +35781,7 @@
         </w:r>
       </w:ins>
       <w:hyperlink r:id="rIdRef5" w:history="1">
-        <w:ins w:id="36375" w:author="Albert Kwame Osei-Owusu" w:date="2026-09-14T09:00:00Z">
+        <w:ins w:id="117780" w:author="Albert Kwame Osei-Owusu" w:date="2026-09-14T09:00:00Z">
           <w:r>
             <w:rPr>
               <w:rStyle w:val="Hyperlink"/>
@@ -35794,7 +35794,7 @@
           </w:r>
         </w:ins>
       </w:hyperlink>
-      <w:ins w:id="36376" w:author="Albert Kwame Osei-Owusu" w:date="2026-09-14T09:00:00Z">
+      <w:ins w:id="117781" w:author="Albert Kwame Osei-Owusu" w:date="2026-09-14T09:00:00Z">
         <w:r>
           <w:rPr>
             <w:rFonts w:ascii="Times New Roman" w:hAnsi="Times New Roman" w:cs="Times New Roman"/>
@@ -35811,14 +35811,14 @@
         <w:spacing w:after="60" w:line="240" w:lineRule="auto"/>
         <w:ind w:left="567" w:hanging="567"/>
         <w:rPr>
-          <w:ins w:id="36377" w:author="Albert Kwame Osei-Owusu" w:date="2026-09-14T09:00:00Z"/>
+          <w:ins w:id="117782" w:author="Albert Kwame Osei-Owusu" w:date="2026-09-14T09:00:00Z"/>
           <w:rFonts w:ascii="Times New Roman" w:hAnsi="Times New Roman" w:cs="Times New Roman"/>
           <w:sz w:val="20"/>
           <w:szCs w:val="20"/>
           <w:lang w:val="en-GB"/>
         </w:rPr>
       </w:pPr>
-      <w:ins w:id="36378" w:author="Albert Kwame Osei-Owusu" w:date="2026-09-14T09:00:00Z">
+      <w:ins w:id="117783" w:author="Albert Kwame Osei-Owusu" w:date="2026-09-14T09:00:00Z">
         <w:r>
           <w:rPr>
             <w:rFonts w:ascii="Times New Roman" w:hAnsi="Times New Roman" w:cs="Times New Roman"/>
@@ -35848,7 +35848,7 @@
         </w:r>
       </w:ins>
       <w:hyperlink r:id="rIdRef6" w:history="1">
-        <w:ins w:id="36379" w:author="Albert Kwame Osei-Owusu" w:date="2026-09-14T09:00:00Z">
+        <w:ins w:id="117784" w:author="Albert Kwame Osei-Owusu" w:date="2026-09-14T09:00:00Z">
           <w:r>
             <w:rPr>
               <w:rStyle w:val="Hyperlink"/>
@@ -35861,7 +35861,7 @@
           </w:r>
         </w:ins>
       </w:hyperlink>
-      <w:ins w:id="36380" w:author="Albert Kwame Osei-Owusu" w:date="2026-09-14T09:00:00Z">
+      <w:ins w:id="117785" w:author="Albert Kwame Osei-Owusu" w:date="2026-09-14T09:00:00Z">
         <w:r>
           <w:rPr>
             <w:rFonts w:ascii="Times New Roman" w:hAnsi="Times New Roman" w:cs="Times New Roman"/>
@@ -35878,14 +35878,14 @@
         <w:spacing w:after="60" w:line="240" w:lineRule="auto"/>
         <w:ind w:left="567" w:hanging="567"/>
         <w:rPr>
-          <w:ins w:id="36381" w:author="Albert Kwame Osei-Owusu" w:date="2026-09-14T09:00:00Z"/>
+          <w:ins w:id="117786" w:author="Albert Kwame Osei-Owusu" w:date="2026-09-14T09:00:00Z"/>
           <w:rFonts w:ascii="Times New Roman" w:hAnsi="Times New Roman" w:cs="Times New Roman"/>
           <w:sz w:val="20"/>
           <w:szCs w:val="20"/>
           <w:lang w:val="en-GB"/>
         </w:rPr>
       </w:pPr>
-      <w:ins w:id="36382" w:author="Albert Kwame Osei-Owusu" w:date="2026-09-14T09:00:00Z">
+      <w:ins w:id="117787" w:author="Albert Kwame Osei-Owusu" w:date="2026-09-14T09:00:00Z">
         <w:r>
           <w:rPr>
             <w:rFonts w:ascii="Times New Roman" w:hAnsi="Times New Roman" w:cs="Times New Roman"/>
@@ -35915,7 +35915,7 @@
         </w:r>
       </w:ins>
       <w:hyperlink r:id="rIdRef7" w:history="1">
-        <w:ins w:id="36383" w:author="Albert Kwame Osei-Owusu" w:date="2026-09-14T09:00:00Z">
+        <w:ins w:id="117788" w:author="Albert Kwame Osei-Owusu" w:date="2026-09-14T09:00:00Z">
           <w:r>
             <w:rPr>
               <w:rStyle w:val="Hyperlink"/>
@@ -35928,7 +35928,7 @@
           </w:r>
         </w:ins>
       </w:hyperlink>
-      <w:ins w:id="36384" w:author="Albert Kwame Osei-Owusu" w:date="2026-09-14T09:00:00Z">
+      <w:ins w:id="117789" w:author="Albert Kwame Osei-Owusu" w:date="2026-09-14T09:00:00Z">
         <w:r>
           <w:rPr>
             <w:rFonts w:ascii="Times New Roman" w:hAnsi="Times New Roman" w:cs="Times New Roman"/>
@@ -35945,14 +35945,14 @@
         <w:spacing w:after="60" w:line="240" w:lineRule="auto"/>
         <w:ind w:left="567" w:hanging="567"/>
         <w:rPr>
-          <w:ins w:id="36385" w:author="Albert Kwame Osei-Owusu" w:date="2026-09-14T09:00:00Z"/>
+          <w:ins w:id="117790" w:author="Albert Kwame Osei-Owusu" w:date="2026-09-14T09:00:00Z"/>
           <w:rFonts w:ascii="Times New Roman" w:hAnsi="Times New Roman" w:cs="Times New Roman"/>
           <w:sz w:val="20"/>
           <w:szCs w:val="20"/>
           <w:lang w:val="en-GB"/>
         </w:rPr>
       </w:pPr>
-      <w:ins w:id="36386" w:author="Albert Kwame Osei-Owusu" w:date="2026-09-14T09:00:00Z">
+      <w:ins w:id="117791" w:author="Albert Kwame Osei-Owusu" w:date="2026-09-14T09:00:00Z">
         <w:r>
           <w:rPr>
             <w:rFonts w:ascii="Times New Roman" w:hAnsi="Times New Roman" w:cs="Times New Roman"/>
@@ -35982,7 +35982,7 @@
         </w:r>
       </w:ins>
       <w:hyperlink r:id="rIdRef8" w:history="1">
-        <w:ins w:id="36387" w:author="Albert Kwame Osei-Owusu" w:date="2026-09-14T09:00:00Z">
+        <w:ins w:id="117792" w:author="Albert Kwame Osei-Owusu" w:date="2026-09-14T09:00:00Z">
           <w:r>
             <w:rPr>
               <w:rStyle w:val="Hyperlink"/>
@@ -35995,7 +35995,7 @@
           </w:r>
         </w:ins>
       </w:hyperlink>
-      <w:ins w:id="36388" w:author="Albert Kwame Osei-Owusu" w:date="2026-09-14T09:00:00Z">
+      <w:ins w:id="117793" w:author="Albert Kwame Osei-Owusu" w:date="2026-09-14T09:00:00Z">
         <w:r>
           <w:rPr>
             <w:rFonts w:ascii="Times New Roman" w:hAnsi="Times New Roman" w:cs="Times New Roman"/>
@@ -36012,14 +36012,14 @@
         <w:spacing w:after="60" w:line="240" w:lineRule="auto"/>
         <w:ind w:left="567" w:hanging="567"/>
         <w:rPr>
-          <w:ins w:id="36389" w:author="Albert Kwame Osei-Owusu" w:date="2026-09-14T09:00:00Z"/>
+          <w:ins w:id="117794" w:author="Albert Kwame Osei-Owusu" w:date="2026-09-14T09:00:00Z"/>
           <w:rFonts w:ascii="Times New Roman" w:hAnsi="Times New Roman" w:cs="Times New Roman"/>
           <w:sz w:val="20"/>
           <w:szCs w:val="20"/>
           <w:lang w:val="en-GB"/>
         </w:rPr>
       </w:pPr>
-      <w:ins w:id="36390" w:author="Albert Kwame Osei-Owusu" w:date="2026-09-14T09:00:00Z">
+      <w:ins w:id="117795" w:author="Albert Kwame Osei-Owusu" w:date="2026-09-14T09:00:00Z">
         <w:r>
           <w:rPr>
             <w:rFonts w:ascii="Times New Roman" w:hAnsi="Times New Roman" w:cs="Times New Roman"/>
@@ -36049,7 +36049,7 @@
         </w:r>
       </w:ins>
       <w:hyperlink r:id="rIdRef9" w:history="1">
-        <w:ins w:id="36391" w:author="Albert Kwame Osei-Owusu" w:date="2026-09-14T09:00:00Z">
+        <w:ins w:id="117796" w:author="Albert Kwame Osei-Owusu" w:date="2026-09-14T09:00:00Z">
           <w:r>
             <w:rPr>
               <w:rStyle w:val="Hyperlink"/>
@@ -36062,7 +36062,7 @@
           </w:r>
         </w:ins>
       </w:hyperlink>
-      <w:ins w:id="36392" w:author="Albert Kwame Osei-Owusu" w:date="2026-09-14T09:00:00Z">
+      <w:ins w:id="117797" w:author="Albert Kwame Osei-Owusu" w:date="2026-09-14T09:00:00Z">
         <w:r>
           <w:rPr>
             <w:rFonts w:ascii="Times New Roman" w:hAnsi="Times New Roman" w:cs="Times New Roman"/>
@@ -36079,14 +36079,14 @@
         <w:spacing w:after="60" w:line="240" w:lineRule="auto"/>
         <w:ind w:left="567" w:hanging="567"/>
         <w:rPr>
-          <w:ins w:id="36393" w:author="Albert Kwame Osei-Owusu" w:date="2026-09-14T09:00:00Z"/>
+          <w:ins w:id="117798" w:author="Albert Kwame Osei-Owusu" w:date="2026-09-14T09:00:00Z"/>
           <w:rFonts w:ascii="Times New Roman" w:hAnsi="Times New Roman" w:cs="Times New Roman"/>
           <w:sz w:val="20"/>
           <w:szCs w:val="20"/>
           <w:lang w:val="en-GB"/>
         </w:rPr>
       </w:pPr>
-      <w:ins w:id="36394" w:author="Albert Kwame Osei-Owusu" w:date="2026-09-14T09:00:00Z">
+      <w:ins w:id="117799" w:author="Albert Kwame Osei-Owusu" w:date="2026-09-14T09:00:00Z">
         <w:r>
           <w:rPr>
             <w:rFonts w:ascii="Times New Roman" w:hAnsi="Times New Roman" w:cs="Times New Roman"/>
@@ -36116,7 +36116,7 @@
         </w:r>
       </w:ins>
       <w:hyperlink r:id="rIdRef10" w:history="1">
-        <w:ins w:id="36395" w:author="Albert Kwame Osei-Owusu" w:date="2026-09-14T09:00:00Z">
+        <w:ins w:id="117800" w:author="Albert Kwame Osei-Owusu" w:date="2026-09-14T09:00:00Z">
           <w:r>
             <w:rPr>
               <w:rStyle w:val="Hyperlink"/>
@@ -36129,7 +36129,7 @@
           </w:r>
         </w:ins>
       </w:hyperlink>
-      <w:ins w:id="36396" w:author="Albert Kwame Osei-Owusu" w:date="2026-09-14T09:00:00Z">
+      <w:ins w:id="117801" w:author="Albert Kwame Osei-Owusu" w:date="2026-09-14T09:00:00Z">
         <w:r>
           <w:rPr>
             <w:rFonts w:ascii="Times New Roman" w:hAnsi="Times New Roman" w:cs="Times New Roman"/>
@@ -36146,14 +36146,14 @@
         <w:spacing w:after="60" w:line="240" w:lineRule="auto"/>
         <w:ind w:left="567" w:hanging="567"/>
         <w:rPr>
-          <w:ins w:id="36397" w:author="Albert Kwame Osei-Owusu" w:date="2026-09-14T09:00:00Z"/>
+          <w:ins w:id="117802" w:author="Albert Kwame Osei-Owusu" w:date="2026-09-14T09:00:00Z"/>
           <w:rFonts w:ascii="Times New Roman" w:hAnsi="Times New Roman" w:cs="Times New Roman"/>
           <w:sz w:val="20"/>
           <w:szCs w:val="20"/>
           <w:lang w:val="en-GB"/>
         </w:rPr>
       </w:pPr>
-      <w:ins w:id="36398" w:author="Albert Kwame Osei-Owusu" w:date="2026-09-14T09:00:00Z">
+      <w:ins w:id="117803" w:author="Albert Kwame Osei-Owusu" w:date="2026-09-14T09:00:00Z">
         <w:r>
           <w:rPr>
             <w:rFonts w:ascii="Times New Roman" w:hAnsi="Times New Roman" w:cs="Times New Roman"/>
@@ -36183,7 +36183,7 @@
         </w:r>
       </w:ins>
       <w:hyperlink r:id="rIdRef11" w:history="1">
-        <w:ins w:id="36399" w:author="Albert Kwame Osei-Owusu" w:date="2026-09-14T09:00:00Z">
+        <w:ins w:id="117804" w:author="Albert Kwame Osei-Owusu" w:date="2026-09-14T09:00:00Z">
           <w:r>
             <w:rPr>
               <w:rStyle w:val="Hyperlink"/>
@@ -36196,7 +36196,7 @@
           </w:r>
         </w:ins>
       </w:hyperlink>
-      <w:ins w:id="36400" w:author="Albert Kwame Osei-Owusu" w:date="2026-09-14T09:00:00Z">
+      <w:ins w:id="117805" w:author="Albert Kwame Osei-Owusu" w:date="2026-09-14T09:00:00Z">
         <w:r>
           <w:rPr>
             <w:rFonts w:ascii="Times New Roman" w:hAnsi="Times New Roman" w:cs="Times New Roman"/>
@@ -36213,14 +36213,14 @@
         <w:spacing w:after="60" w:line="240" w:lineRule="auto"/>
         <w:ind w:left="567" w:hanging="567"/>
         <w:rPr>
-          <w:ins w:id="36401" w:author="Albert Kwame Osei-Owusu" w:date="2026-09-14T09:00:00Z"/>
+          <w:ins w:id="117806" w:author="Albert Kwame Osei-Owusu" w:date="2026-09-14T09:00:00Z"/>
           <w:rFonts w:ascii="Times New Roman" w:hAnsi="Times New Roman" w:cs="Times New Roman"/>
           <w:sz w:val="20"/>
           <w:szCs w:val="20"/>
           <w:lang w:val="en-GB"/>
         </w:rPr>
       </w:pPr>
-      <w:ins w:id="36402" w:author="Albert Kwame Osei-Owusu" w:date="2026-09-14T09:00:00Z">
+      <w:ins w:id="117807" w:author="Albert Kwame Osei-Owusu" w:date="2026-09-14T09:00:00Z">
         <w:r>
           <w:rPr>
             <w:rFonts w:ascii="Times New Roman" w:hAnsi="Times New Roman" w:cs="Times New Roman"/>
@@ -36250,7 +36250,7 @@
         </w:r>
       </w:ins>
       <w:hyperlink r:id="rIdRef12" w:history="1">
-        <w:ins w:id="36403" w:author="Albert Kwame Osei-Owusu" w:date="2026-09-14T09:00:00Z">
+        <w:ins w:id="117808" w:author="Albert Kwame Osei-Owusu" w:date="2026-09-14T09:00:00Z">
           <w:r>
             <w:rPr>
               <w:rStyle w:val="Hyperlink"/>
@@ -36263,7 +36263,7 @@
           </w:r>
         </w:ins>
       </w:hyperlink>
-      <w:ins w:id="36404" w:author="Albert Kwame Osei-Owusu" w:date="2026-09-14T09:00:00Z">
+      <w:ins w:id="117809" w:author="Albert Kwame Osei-Owusu" w:date="2026-09-14T09:00:00Z">
         <w:r>
           <w:rPr>
             <w:rFonts w:ascii="Times New Roman" w:hAnsi="Times New Roman" w:cs="Times New Roman"/>
@@ -36280,14 +36280,14 @@
         <w:spacing w:after="60" w:line="240" w:lineRule="auto"/>
         <w:ind w:left="567" w:hanging="567"/>
         <w:rPr>
-          <w:ins w:id="36405" w:author="Albert Kwame Osei-Owusu" w:date="2026-09-14T09:00:00Z"/>
+          <w:ins w:id="117810" w:author="Albert Kwame Osei-Owusu" w:date="2026-09-14T09:00:00Z"/>
           <w:rFonts w:ascii="Times New Roman" w:hAnsi="Times New Roman" w:cs="Times New Roman"/>
           <w:sz w:val="20"/>
           <w:szCs w:val="20"/>
           <w:lang w:val="en-GB"/>
         </w:rPr>
       </w:pPr>
-      <w:ins w:id="36406" w:author="Albert Kwame Osei-Owusu" w:date="2026-09-14T09:00:00Z">
+      <w:ins w:id="117811" w:author="Albert Kwame Osei-Owusu" w:date="2026-09-14T09:00:00Z">
         <w:r>
           <w:rPr>
             <w:rFonts w:ascii="Times New Roman" w:hAnsi="Times New Roman" w:cs="Times New Roman"/>
@@ -36317,7 +36317,7 @@
         </w:r>
       </w:ins>
       <w:hyperlink r:id="rIdRef13" w:history="1">
-        <w:ins w:id="36407" w:author="Albert Kwame Osei-Owusu" w:date="2026-09-14T09:00:00Z">
+        <w:ins w:id="117812" w:author="Albert Kwame Osei-Owusu" w:date="2026-09-14T09:00:00Z">
           <w:r>
             <w:rPr>
               <w:rStyle w:val="Hyperlink"/>
@@ -36330,7 +36330,7 @@
           </w:r>
         </w:ins>
       </w:hyperlink>
-      <w:ins w:id="36408" w:author="Albert Kwame Osei-Owusu" w:date="2026-09-14T09:00:00Z">
+      <w:ins w:id="117813" w:author="Albert Kwame Osei-Owusu" w:date="2026-09-14T09:00:00Z">
         <w:r>
           <w:rPr>
             <w:rFonts w:ascii="Times New Roman" w:hAnsi="Times New Roman" w:cs="Times New Roman"/>
@@ -36347,14 +36347,14 @@
         <w:spacing w:after="60" w:line="240" w:lineRule="auto"/>
         <w:ind w:left="567" w:hanging="567"/>
         <w:rPr>
-          <w:ins w:id="36409" w:author="Albert Kwame Osei-Owusu" w:date="2026-09-14T09:00:00Z"/>
+          <w:ins w:id="117814" w:author="Albert Kwame Osei-Owusu" w:date="2026-09-14T09:00:00Z"/>
           <w:rFonts w:ascii="Times New Roman" w:hAnsi="Times New Roman" w:cs="Times New Roman"/>
           <w:sz w:val="20"/>
           <w:szCs w:val="20"/>
           <w:lang w:val="en-GB"/>
         </w:rPr>
       </w:pPr>
-      <w:ins w:id="36410" w:author="Albert Kwame Osei-Owusu" w:date="2026-09-14T09:00:00Z">
+      <w:ins w:id="117815" w:author="Albert Kwame Osei-Owusu" w:date="2026-09-14T09:00:00Z">
         <w:r>
           <w:rPr>
             <w:rFonts w:ascii="Times New Roman" w:hAnsi="Times New Roman" w:cs="Times New Roman"/>
@@ -36384,7 +36384,7 @@
         </w:r>
       </w:ins>
       <w:hyperlink r:id="rIdRef14" w:history="1">
-        <w:ins w:id="36411" w:author="Albert Kwame Osei-Owusu" w:date="2026-09-14T09:00:00Z">
+        <w:ins w:id="117816" w:author="Albert Kwame Osei-Owusu" w:date="2026-09-14T09:00:00Z">
           <w:r>
             <w:rPr>
               <w:rStyle w:val="Hyperlink"/>
@@ -36397,7 +36397,7 @@
           </w:r>
         </w:ins>
       </w:hyperlink>
-      <w:ins w:id="36412" w:author="Albert Kwame Osei-Owusu" w:date="2026-09-14T09:00:00Z">
+      <w:ins w:id="117817" w:author="Albert Kwame Osei-Owusu" w:date="2026-09-14T09:00:00Z">
         <w:r>
           <w:rPr>
             <w:rFonts w:ascii="Times New Roman" w:hAnsi="Times New Roman" w:cs="Times New Roman"/>
@@ -36414,14 +36414,14 @@
         <w:spacing w:after="60" w:line="240" w:lineRule="auto"/>
         <w:ind w:left="567" w:hanging="567"/>
         <w:rPr>
-          <w:ins w:id="36413" w:author="Albert Kwame Osei-Owusu" w:date="2026-09-14T09:00:00Z"/>
+          <w:ins w:id="117818" w:author="Albert Kwame Osei-Owusu" w:date="2026-09-14T09:00:00Z"/>
           <w:rFonts w:ascii="Times New Roman" w:hAnsi="Times New Roman" w:cs="Times New Roman"/>
           <w:sz w:val="20"/>
           <w:szCs w:val="20"/>
           <w:lang w:val="en-GB"/>
         </w:rPr>
       </w:pPr>
-      <w:ins w:id="36414" w:author="Albert Kwame Osei-Owusu" w:date="2026-09-14T09:00:00Z">
+      <w:ins w:id="117819" w:author="Albert Kwame Osei-Owusu" w:date="2026-09-14T09:00:00Z">
         <w:r>
           <w:rPr>
             <w:rFonts w:ascii="Times New Roman" w:hAnsi="Times New Roman" w:cs="Times New Roman"/>
@@ -36451,7 +36451,7 @@
         </w:r>
       </w:ins>
       <w:hyperlink r:id="rIdRef15" w:history="1">
-        <w:ins w:id="36415" w:author="Albert Kwame Osei-Owusu" w:date="2026-09-14T09:00:00Z">
+        <w:ins w:id="117820" w:author="Albert Kwame Osei-Owusu" w:date="2026-09-14T09:00:00Z">
           <w:r>
             <w:rPr>
               <w:rStyle w:val="Hyperlink"/>
@@ -36464,7 +36464,7 @@
           </w:r>
         </w:ins>
       </w:hyperlink>
-      <w:ins w:id="36416" w:author="Albert Kwame Osei-Owusu" w:date="2026-09-14T09:00:00Z">
+      <w:ins w:id="117821" w:author="Albert Kwame Osei-Owusu" w:date="2026-09-14T09:00:00Z">
         <w:r>
           <w:rPr>
             <w:rFonts w:ascii="Times New Roman" w:hAnsi="Times New Roman" w:cs="Times New Roman"/>
@@ -36481,14 +36481,14 @@
         <w:spacing w:after="60" w:line="240" w:lineRule="auto"/>
         <w:ind w:left="567" w:hanging="567"/>
         <w:rPr>
-          <w:ins w:id="36417" w:author="Albert Kwame Osei-Owusu" w:date="2026-09-14T09:00:00Z"/>
+          <w:ins w:id="117822" w:author="Albert Kwame Osei-Owusu" w:date="2026-09-14T09:00:00Z"/>
           <w:rFonts w:ascii="Times New Roman" w:hAnsi="Times New Roman" w:cs="Times New Roman"/>
           <w:sz w:val="20"/>
           <w:szCs w:val="20"/>
           <w:lang w:val="en-GB"/>
         </w:rPr>
       </w:pPr>
-      <w:ins w:id="36418" w:author="Albert Kwame Osei-Owusu" w:date="2026-09-14T09:00:00Z">
+      <w:ins w:id="117823" w:author="Albert Kwame Osei-Owusu" w:date="2026-09-14T09:00:00Z">
         <w:r>
           <w:rPr>
             <w:rFonts w:ascii="Times New Roman" w:hAnsi="Times New Roman" w:cs="Times New Roman"/>
@@ -36518,7 +36518,7 @@
         </w:r>
       </w:ins>
       <w:hyperlink r:id="rIdRef16" w:history="1">
-        <w:ins w:id="36419" w:author="Albert Kwame Osei-Owusu" w:date="2026-09-14T09:00:00Z">
+        <w:ins w:id="117824" w:author="Albert Kwame Osei-Owusu" w:date="2026-09-14T09:00:00Z">
           <w:r>
             <w:rPr>
               <w:rStyle w:val="Hyperlink"/>
@@ -36531,7 +36531,7 @@
           </w:r>
         </w:ins>
       </w:hyperlink>
-      <w:ins w:id="36420" w:author="Albert Kwame Osei-Owusu" w:date="2026-09-14T09:00:00Z">
+      <w:ins w:id="117825" w:author="Albert Kwame Osei-Owusu" w:date="2026-09-14T09:00:00Z">
         <w:r>
           <w:rPr>
             <w:rFonts w:ascii="Times New Roman" w:hAnsi="Times New Roman" w:cs="Times New Roman"/>
@@ -36548,14 +36548,14 @@
         <w:spacing w:after="60" w:line="240" w:lineRule="auto"/>
         <w:ind w:left="567" w:hanging="567"/>
         <w:rPr>
-          <w:ins w:id="36421" w:author="Albert Kwame Osei-Owusu" w:date="2026-09-14T09:00:00Z"/>
+          <w:ins w:id="117826" w:author="Albert Kwame Osei-Owusu" w:date="2026-09-14T09:00:00Z"/>
           <w:rFonts w:ascii="Times New Roman" w:hAnsi="Times New Roman" w:cs="Times New Roman"/>
           <w:sz w:val="20"/>
           <w:szCs w:val="20"/>
           <w:lang w:val="en-GB"/>
         </w:rPr>
       </w:pPr>
-      <w:ins w:id="36422" w:author="Albert Kwame Osei-Owusu" w:date="2026-09-14T09:00:00Z">
+      <w:ins w:id="117827" w:author="Albert Kwame Osei-Owusu" w:date="2026-09-14T09:00:00Z">
         <w:r>
           <w:rPr>
             <w:rFonts w:ascii="Times New Roman" w:hAnsi="Times New Roman" w:cs="Times New Roman"/>
@@ -36585,7 +36585,7 @@
         </w:r>
       </w:ins>
       <w:hyperlink r:id="rIdRef17" w:history="1">
-        <w:ins w:id="36423" w:author="Albert Kwame Osei-Owusu" w:date="2026-09-14T09:00:00Z">
+        <w:ins w:id="117828" w:author="Albert Kwame Osei-Owusu" w:date="2026-09-14T09:00:00Z">
           <w:r>
             <w:rPr>
               <w:rStyle w:val="Hyperlink"/>
@@ -36598,7 +36598,7 @@
           </w:r>
         </w:ins>
       </w:hyperlink>
-      <w:ins w:id="36424" w:author="Albert Kwame Osei-Owusu" w:date="2026-09-14T09:00:00Z">
+      <w:ins w:id="117829" w:author="Albert Kwame Osei-Owusu" w:date="2026-09-14T09:00:00Z">
         <w:r>
           <w:rPr>
             <w:rFonts w:ascii="Times New Roman" w:hAnsi="Times New Roman" w:cs="Times New Roman"/>
@@ -36610,7 +36610,7 @@
         </w:r>
       </w:ins>
       <w:hyperlink r:id="rIdRef18" w:history="1">
-        <w:ins w:id="36425" w:author="Albert Kwame Osei-Owusu" w:date="2026-09-14T09:00:00Z">
+        <w:ins w:id="117830" w:author="Albert Kwame Osei-Owusu" w:date="2026-09-14T09:00:00Z">
           <w:r>
             <w:rPr>
               <w:rStyle w:val="Hyperlink"/>
@@ -36623,7 +36623,7 @@
           </w:r>
         </w:ins>
       </w:hyperlink>
-      <w:ins w:id="36426" w:author="Albert Kwame Osei-Owusu" w:date="2026-09-14T09:00:00Z">
+      <w:ins w:id="117831" w:author="Albert Kwame Osei-Owusu" w:date="2026-09-14T09:00:00Z">
         <w:r>
           <w:rPr>
             <w:rFonts w:ascii="Times New Roman" w:hAnsi="Times New Roman" w:cs="Times New Roman"/>
@@ -36635,7 +36635,7 @@
         </w:r>
       </w:ins>
       <w:hyperlink r:id="rIdRef19" w:history="1">
-        <w:ins w:id="36427" w:author="Albert Kwame Osei-Owusu" w:date="2026-09-14T09:00:00Z">
+        <w:ins w:id="117832" w:author="Albert Kwame Osei-Owusu" w:date="2026-09-14T09:00:00Z">
           <w:r>
             <w:rPr>
               <w:rStyle w:val="Hyperlink"/>
@@ -36648,7 +36648,7 @@
           </w:r>
         </w:ins>
       </w:hyperlink>
-      <w:ins w:id="36428" w:author="Albert Kwame Osei-Owusu" w:date="2026-09-14T09:00:00Z">
+      <w:ins w:id="117833" w:author="Albert Kwame Osei-Owusu" w:date="2026-09-14T09:00:00Z">
         <w:r>
           <w:rPr>
             <w:rFonts w:ascii="Times New Roman" w:hAnsi="Times New Roman" w:cs="Times New Roman"/>
@@ -36665,14 +36665,14 @@
         <w:spacing w:after="60" w:line="240" w:lineRule="auto"/>
         <w:ind w:left="567" w:hanging="567"/>
         <w:rPr>
-          <w:ins w:id="36429" w:author="Albert Kwame Osei-Owusu" w:date="2026-09-14T09:00:00Z"/>
+          <w:ins w:id="117834" w:author="Albert Kwame Osei-Owusu" w:date="2026-09-14T09:00:00Z"/>
           <w:rFonts w:ascii="Times New Roman" w:hAnsi="Times New Roman" w:cs="Times New Roman"/>
           <w:sz w:val="20"/>
           <w:szCs w:val="20"/>
           <w:lang w:val="en-GB"/>
         </w:rPr>
       </w:pPr>
-      <w:ins w:id="36430" w:author="Albert Kwame Osei-Owusu" w:date="2026-09-14T09:00:00Z">
+      <w:ins w:id="117835" w:author="Albert Kwame Osei-Owusu" w:date="2026-09-14T09:00:00Z">
         <w:r>
           <w:rPr>
             <w:rFonts w:ascii="Times New Roman" w:hAnsi="Times New Roman" w:cs="Times New Roman"/>
@@ -36702,7 +36702,7 @@
         </w:r>
       </w:ins>
       <w:hyperlink r:id="rIdRef20" w:history="1">
-        <w:ins w:id="36431" w:author="Albert Kwame Osei-Owusu" w:date="2026-09-14T09:00:00Z">
+        <w:ins w:id="117836" w:author="Albert Kwame Osei-Owusu" w:date="2026-09-14T09:00:00Z">
           <w:r>
             <w:rPr>
               <w:rStyle w:val="Hyperlink"/>
@@ -36715,7 +36715,7 @@
           </w:r>
         </w:ins>
       </w:hyperlink>
-      <w:ins w:id="36432" w:author="Albert Kwame Osei-Owusu" w:date="2026-09-14T09:00:00Z">
+      <w:ins w:id="117837" w:author="Albert Kwame Osei-Owusu" w:date="2026-09-14T09:00:00Z">
         <w:r>
           <w:rPr>
             <w:rFonts w:ascii="Times New Roman" w:hAnsi="Times New Roman" w:cs="Times New Roman"/>
@@ -36732,14 +36732,14 @@
         <w:spacing w:after="60" w:line="240" w:lineRule="auto"/>
         <w:ind w:left="567" w:hanging="567"/>
         <w:rPr>
-          <w:ins w:id="36433" w:author="Albert Kwame Osei-Owusu" w:date="2026-09-14T09:00:00Z"/>
+          <w:ins w:id="117838" w:author="Albert Kwame Osei-Owusu" w:date="2026-09-14T09:00:00Z"/>
           <w:rFonts w:ascii="Times New Roman" w:hAnsi="Times New Roman" w:cs="Times New Roman"/>
           <w:sz w:val="20"/>
           <w:szCs w:val="20"/>
           <w:lang w:val="en-GB"/>
         </w:rPr>
       </w:pPr>
-      <w:ins w:id="36434" w:author="Albert Kwame Osei-Owusu" w:date="2026-09-14T09:00:00Z">
+      <w:ins w:id="117839" w:author="Albert Kwame Osei-Owusu" w:date="2026-09-14T09:00:00Z">
         <w:r>
           <w:rPr>
             <w:rFonts w:ascii="Times New Roman" w:hAnsi="Times New Roman" w:cs="Times New Roman"/>
@@ -36769,7 +36769,7 @@
         </w:r>
       </w:ins>
       <w:hyperlink r:id="rIdRef21" w:history="1">
-        <w:ins w:id="36435" w:author="Albert Kwame Osei-Owusu" w:date="2026-09-14T09:00:00Z">
+        <w:ins w:id="117840" w:author="Albert Kwame Osei-Owusu" w:date="2026-09-14T09:00:00Z">
           <w:r>
             <w:rPr>
               <w:rStyle w:val="Hyperlink"/>
@@ -36782,7 +36782,7 @@
           </w:r>
         </w:ins>
       </w:hyperlink>
-      <w:ins w:id="36436" w:author="Albert Kwame Osei-Owusu" w:date="2026-09-14T09:00:00Z">
+      <w:ins w:id="117841" w:author="Albert Kwame Osei-Owusu" w:date="2026-09-14T09:00:00Z">
         <w:r>
           <w:rPr>
             <w:rFonts w:ascii="Times New Roman" w:hAnsi="Times New Roman" w:cs="Times New Roman"/>
@@ -36799,14 +36799,14 @@
         <w:spacing w:after="60" w:line="240" w:lineRule="auto"/>
         <w:ind w:left="567" w:hanging="567"/>
         <w:rPr>
-          <w:ins w:id="36437" w:author="Albert Kwame Osei-Owusu" w:date="2026-09-14T09:00:00Z"/>
+          <w:ins w:id="117842" w:author="Albert Kwame Osei-Owusu" w:date="2026-09-14T09:00:00Z"/>
           <w:rFonts w:ascii="Times New Roman" w:hAnsi="Times New Roman" w:cs="Times New Roman"/>
           <w:sz w:val="20"/>
           <w:szCs w:val="20"/>
           <w:lang w:val="en-GB"/>
         </w:rPr>
       </w:pPr>
-      <w:ins w:id="36438" w:author="Albert Kwame Osei-Owusu" w:date="2026-09-14T09:00:00Z">
+      <w:ins w:id="117843" w:author="Albert Kwame Osei-Owusu" w:date="2026-09-14T09:00:00Z">
         <w:r>
           <w:rPr>
             <w:rFonts w:ascii="Times New Roman" w:hAnsi="Times New Roman" w:cs="Times New Roman"/>
@@ -36836,7 +36836,7 @@
         </w:r>
       </w:ins>
       <w:hyperlink r:id="rIdRef22" w:history="1">
-        <w:ins w:id="36439" w:author="Albert Kwame Osei-Owusu" w:date="2026-09-14T09:00:00Z">
+        <w:ins w:id="117844" w:author="Albert Kwame Osei-Owusu" w:date="2026-09-14T09:00:00Z">
           <w:r>
             <w:rPr>
               <w:rStyle w:val="Hyperlink"/>
@@ -36849,7 +36849,7 @@
           </w:r>
         </w:ins>
       </w:hyperlink>
-      <w:ins w:id="36440" w:author="Albert Kwame Osei-Owusu" w:date="2026-09-14T09:00:00Z">
+      <w:ins w:id="117845" w:author="Albert Kwame Osei-Owusu" w:date="2026-09-14T09:00:00Z">
         <w:r>
           <w:rPr>
             <w:rFonts w:ascii="Times New Roman" w:hAnsi="Times New Roman" w:cs="Times New Roman"/>
@@ -36866,14 +36866,14 @@
         <w:spacing w:after="60" w:line="240" w:lineRule="auto"/>
         <w:ind w:left="567" w:hanging="567"/>
         <w:rPr>
-          <w:ins w:id="36441" w:author="Albert Kwame Osei-Owusu" w:date="2026-09-14T09:00:00Z"/>
+          <w:ins w:id="117846" w:author="Albert Kwame Osei-Owusu" w:date="2026-09-14T09:00:00Z"/>
           <w:rFonts w:ascii="Times New Roman" w:hAnsi="Times New Roman" w:cs="Times New Roman"/>
           <w:sz w:val="20"/>
           <w:szCs w:val="20"/>
           <w:lang w:val="en-GB"/>
         </w:rPr>
       </w:pPr>
-      <w:ins w:id="36442" w:author="Albert Kwame Osei-Owusu" w:date="2026-09-14T09:00:00Z">
+      <w:ins w:id="117847" w:author="Albert Kwame Osei-Owusu" w:date="2026-09-14T09:00:00Z">
         <w:r>
           <w:rPr>
             <w:rFonts w:ascii="Times New Roman" w:hAnsi="Times New Roman" w:cs="Times New Roman"/>
@@ -36903,7 +36903,7 @@
         </w:r>
       </w:ins>
       <w:hyperlink r:id="rIdRef23" w:history="1">
-        <w:ins w:id="36443" w:author="Albert Kwame Osei-Owusu" w:date="2026-09-14T09:00:00Z">
+        <w:ins w:id="117848" w:author="Albert Kwame Osei-Owusu" w:date="2026-09-14T09:00:00Z">
           <w:r>
             <w:rPr>
               <w:rStyle w:val="Hyperlink"/>
@@ -36916,7 +36916,7 @@
           </w:r>
         </w:ins>
       </w:hyperlink>
-      <w:ins w:id="36444" w:author="Albert Kwame Osei-Owusu" w:date="2026-09-14T09:00:00Z">
+      <w:ins w:id="117849" w:author="Albert Kwame Osei-Owusu" w:date="2026-09-14T09:00:00Z">
         <w:r>
           <w:rPr>
             <w:rFonts w:ascii="Times New Roman" w:hAnsi="Times New Roman" w:cs="Times New Roman"/>
@@ -36933,14 +36933,14 @@
         <w:spacing w:after="60" w:line="240" w:lineRule="auto"/>
         <w:ind w:left="567" w:hanging="567"/>
         <w:rPr>
-          <w:ins w:id="36445" w:author="Albert Kwame Osei-Owusu" w:date="2026-09-14T09:00:00Z"/>
+          <w:ins w:id="117850" w:author="Albert Kwame Osei-Owusu" w:date="2026-09-14T09:00:00Z"/>
           <w:rFonts w:ascii="Times New Roman" w:hAnsi="Times New Roman" w:cs="Times New Roman"/>
           <w:sz w:val="20"/>
           <w:szCs w:val="20"/>
           <w:lang w:val="en-GB"/>
         </w:rPr>
       </w:pPr>
-      <w:ins w:id="36446" w:author="Albert Kwame Osei-Owusu" w:date="2026-09-14T09:00:00Z">
+      <w:ins w:id="117851" w:author="Albert Kwame Osei-Owusu" w:date="2026-09-14T09:00:00Z">
         <w:r>
           <w:rPr>
             <w:rFonts w:ascii="Times New Roman" w:hAnsi="Times New Roman" w:cs="Times New Roman"/>
@@ -36970,7 +36970,7 @@
         </w:r>
       </w:ins>
       <w:hyperlink r:id="rIdRef24" w:history="1">
-        <w:ins w:id="36447" w:author="Albert Kwame Osei-Owusu" w:date="2026-09-14T09:00:00Z">
+        <w:ins w:id="117852" w:author="Albert Kwame Osei-Owusu" w:date="2026-09-14T09:00:00Z">
           <w:r>
             <w:rPr>
               <w:rStyle w:val="Hyperlink"/>
@@ -36983,7 +36983,7 @@
           </w:r>
         </w:ins>
       </w:hyperlink>
-      <w:ins w:id="36448" w:author="Albert Kwame Osei-Owusu" w:date="2026-09-14T09:00:00Z">
+      <w:ins w:id="117853" w:author="Albert Kwame Osei-Owusu" w:date="2026-09-14T09:00:00Z">
         <w:r>
           <w:rPr>
             <w:rFonts w:ascii="Times New Roman" w:hAnsi="Times New Roman" w:cs="Times New Roman"/>
@@ -37000,14 +37000,14 @@
         <w:spacing w:after="60" w:line="240" w:lineRule="auto"/>
         <w:ind w:left="567" w:hanging="567"/>
         <w:rPr>
-          <w:ins w:id="36449" w:author="Albert Kwame Osei-Owusu" w:date="2026-09-14T09:00:00Z"/>
+          <w:ins w:id="117854" w:author="Albert Kwame Osei-Owusu" w:date="2026-09-14T09:00:00Z"/>
           <w:rFonts w:ascii="Times New Roman" w:hAnsi="Times New Roman" w:cs="Times New Roman"/>
           <w:sz w:val="20"/>
           <w:szCs w:val="20"/>
           <w:lang w:val="en-GB"/>
         </w:rPr>
       </w:pPr>
-      <w:ins w:id="36450" w:author="Albert Kwame Osei-Owusu" w:date="2026-09-14T09:00:00Z">
+      <w:ins w:id="117855" w:author="Albert Kwame Osei-Owusu" w:date="2026-09-14T09:00:00Z">
         <w:r>
           <w:rPr>
             <w:rFonts w:ascii="Times New Roman" w:hAnsi="Times New Roman" w:cs="Times New Roman"/>
@@ -37037,7 +37037,7 @@
         </w:r>
       </w:ins>
       <w:hyperlink r:id="rIdRef25" w:history="1">
-        <w:ins w:id="36451" w:author="Albert Kwame Osei-Owusu" w:date="2026-09-14T09:00:00Z">
+        <w:ins w:id="117856" w:author="Albert Kwame Osei-Owusu" w:date="2026-09-14T09:00:00Z">
           <w:r>
             <w:rPr>
               <w:rStyle w:val="Hyperlink"/>
@@ -37050,7 +37050,7 @@
           </w:r>
         </w:ins>
       </w:hyperlink>
-      <w:ins w:id="36452" w:author="Albert Kwame Osei-Owusu" w:date="2026-09-14T09:00:00Z">
+      <w:ins w:id="117857" w:author="Albert Kwame Osei-Owusu" w:date="2026-09-14T09:00:00Z">
         <w:r>
           <w:rPr>
             <w:rFonts w:ascii="Times New Roman" w:hAnsi="Times New Roman" w:cs="Times New Roman"/>
@@ -37067,14 +37067,14 @@
         <w:spacing w:after="60" w:line="240" w:lineRule="auto"/>
         <w:ind w:left="567" w:hanging="567"/>
         <w:rPr>
-          <w:ins w:id="36453" w:author="Albert Kwame Osei-Owusu" w:date="2026-09-14T09:00:00Z"/>
+          <w:ins w:id="117858" w:author="Albert Kwame Osei-Owusu" w:date="2026-09-14T09:00:00Z"/>
           <w:rFonts w:ascii="Times New Roman" w:hAnsi="Times New Roman" w:cs="Times New Roman"/>
           <w:sz w:val="20"/>
           <w:szCs w:val="20"/>
           <w:lang w:val="en-GB"/>
         </w:rPr>
       </w:pPr>
-      <w:ins w:id="36454" w:author="Albert Kwame Osei-Owusu" w:date="2026-09-14T09:00:00Z">
+      <w:ins w:id="117859" w:author="Albert Kwame Osei-Owusu" w:date="2026-09-14T09:00:00Z">
         <w:r>
           <w:rPr>
             <w:rFonts w:ascii="Times New Roman" w:hAnsi="Times New Roman" w:cs="Times New Roman"/>
@@ -37104,7 +37104,7 @@
         </w:r>
       </w:ins>
       <w:hyperlink r:id="rIdRef26" w:history="1">
-        <w:ins w:id="36455" w:author="Albert Kwame Osei-Owusu" w:date="2026-09-14T09:00:00Z">
+        <w:ins w:id="117860" w:author="Albert Kwame Osei-Owusu" w:date="2026-09-14T09:00:00Z">
           <w:r>
             <w:rPr>
               <w:rStyle w:val="Hyperlink"/>
@@ -37117,7 +37117,7 @@
           </w:r>
         </w:ins>
       </w:hyperlink>
-      <w:ins w:id="36456" w:author="Albert Kwame Osei-Owusu" w:date="2026-09-14T09:00:00Z">
+      <w:ins w:id="117861" w:author="Albert Kwame Osei-Owusu" w:date="2026-09-14T09:00:00Z">
         <w:r>
           <w:rPr>
             <w:rFonts w:ascii="Times New Roman" w:hAnsi="Times New Roman" w:cs="Times New Roman"/>
@@ -37134,14 +37134,14 @@
         <w:spacing w:after="60" w:line="240" w:lineRule="auto"/>
         <w:ind w:left="567" w:hanging="567"/>
         <w:rPr>
-          <w:ins w:id="36457" w:author="Albert Kwame Osei-Owusu" w:date="2026-09-14T09:00:00Z"/>
+          <w:ins w:id="117862" w:author="Albert Kwame Osei-Owusu" w:date="2026-09-14T09:00:00Z"/>
           <w:rFonts w:ascii="Times New Roman" w:hAnsi="Times New Roman" w:cs="Times New Roman"/>
           <w:sz w:val="20"/>
           <w:szCs w:val="20"/>
           <w:lang w:val="en-GB"/>
         </w:rPr>
       </w:pPr>
-      <w:ins w:id="36458" w:author="Albert Kwame Osei-Owusu" w:date="2026-09-14T09:00:00Z">
+      <w:ins w:id="117863" w:author="Albert Kwame Osei-Owusu" w:date="2026-09-14T09:00:00Z">
         <w:r>
           <w:rPr>
             <w:rFonts w:ascii="Times New Roman" w:hAnsi="Times New Roman" w:cs="Times New Roman"/>
@@ -37171,7 +37171,7 @@
         </w:r>
       </w:ins>
       <w:hyperlink r:id="rIdRef27" w:history="1">
-        <w:ins w:id="36459" w:author="Albert Kwame Osei-Owusu" w:date="2026-09-14T09:00:00Z">
+        <w:ins w:id="117864" w:author="Albert Kwame Osei-Owusu" w:date="2026-09-14T09:00:00Z">
           <w:r>
             <w:rPr>
               <w:rStyle w:val="Hyperlink"/>
@@ -37184,7 +37184,7 @@
           </w:r>
         </w:ins>
       </w:hyperlink>
-      <w:ins w:id="36460" w:author="Albert Kwame Osei-Owusu" w:date="2026-09-14T09:00:00Z">
+      <w:ins w:id="117865" w:author="Albert Kwame Osei-Owusu" w:date="2026-09-14T09:00:00Z">
         <w:r>
           <w:rPr>
             <w:rFonts w:ascii="Times New Roman" w:hAnsi="Times New Roman" w:cs="Times New Roman"/>
@@ -37201,14 +37201,14 @@
         <w:spacing w:after="60" w:line="240" w:lineRule="auto"/>
         <w:ind w:left="567" w:hanging="567"/>
         <w:rPr>
-          <w:ins w:id="36461" w:author="Albert Kwame Osei-Owusu" w:date="2026-09-14T09:00:00Z"/>
+          <w:ins w:id="117866" w:author="Albert Kwame Osei-Owusu" w:date="2026-09-14T09:00:00Z"/>
           <w:rFonts w:ascii="Times New Roman" w:hAnsi="Times New Roman" w:cs="Times New Roman"/>
           <w:sz w:val="20"/>
           <w:szCs w:val="20"/>
           <w:lang w:val="en-GB"/>
         </w:rPr>
       </w:pPr>
-      <w:ins w:id="36462" w:author="Albert Kwame Osei-Owusu" w:date="2026-09-14T09:00:00Z">
+      <w:ins w:id="117867" w:author="Albert Kwame Osei-Owusu" w:date="2026-09-14T09:00:00Z">
         <w:r>
           <w:rPr>
             <w:rFonts w:ascii="Times New Roman" w:hAnsi="Times New Roman" w:cs="Times New Roman"/>
@@ -37238,7 +37238,7 @@
         </w:r>
       </w:ins>
       <w:hyperlink r:id="rIdRef28" w:history="1">
-        <w:ins w:id="36463" w:author="Albert Kwame Osei-Owusu" w:date="2026-09-14T09:00:00Z">
+        <w:ins w:id="117868" w:author="Albert Kwame Osei-Owusu" w:date="2026-09-14T09:00:00Z">
           <w:r>
             <w:rPr>
               <w:rStyle w:val="Hyperlink"/>
@@ -37251,7 +37251,7 @@
           </w:r>
         </w:ins>
       </w:hyperlink>
-      <w:ins w:id="36464" w:author="Albert Kwame Osei-Owusu" w:date="2026-09-14T09:00:00Z">
+      <w:ins w:id="117869" w:author="Albert Kwame Osei-Owusu" w:date="2026-09-14T09:00:00Z">
         <w:r>
           <w:rPr>
             <w:rFonts w:ascii="Times New Roman" w:hAnsi="Times New Roman" w:cs="Times New Roman"/>
@@ -37268,14 +37268,14 @@
         <w:spacing w:after="60" w:line="240" w:lineRule="auto"/>
         <w:ind w:left="567" w:hanging="567"/>
         <w:rPr>
-          <w:ins w:id="36465" w:author="Albert Kwame Osei-Owusu" w:date="2026-09-14T09:00:00Z"/>
+          <w:ins w:id="117870" w:author="Albert Kwame Osei-Owusu" w:date="2026-09-14T09:00:00Z"/>
           <w:rFonts w:ascii="Times New Roman" w:hAnsi="Times New Roman" w:cs="Times New Roman"/>
           <w:sz w:val="20"/>
           <w:szCs w:val="20"/>
           <w:lang w:val="en-GB"/>
         </w:rPr>
       </w:pPr>
-      <w:ins w:id="36466" w:author="Albert Kwame Osei-Owusu" w:date="2026-09-14T09:00:00Z">
+      <w:ins w:id="117871" w:author="Albert Kwame Osei-Owusu" w:date="2026-09-14T09:00:00Z">
         <w:r>
           <w:rPr>
             <w:rFonts w:ascii="Times New Roman" w:hAnsi="Times New Roman" w:cs="Times New Roman"/>
@@ -37305,7 +37305,7 @@
         </w:r>
       </w:ins>
       <w:hyperlink r:id="rIdRef29" w:history="1">
-        <w:ins w:id="36467" w:author="Albert Kwame Osei-Owusu" w:date="2026-09-14T09:00:00Z">
+        <w:ins w:id="117872" w:author="Albert Kwame Osei-Owusu" w:date="2026-09-14T09:00:00Z">
           <w:r>
             <w:rPr>
               <w:rStyle w:val="Hyperlink"/>
@@ -37318,7 +37318,7 @@
           </w:r>
         </w:ins>
       </w:hyperlink>
-      <w:ins w:id="36468" w:author="Albert Kwame Osei-Owusu" w:date="2026-09-14T09:00:00Z">
+      <w:ins w:id="117873" w:author="Albert Kwame Osei-Owusu" w:date="2026-09-14T09:00:00Z">
         <w:r>
           <w:rPr>
             <w:rFonts w:ascii="Times New Roman" w:hAnsi="Times New Roman" w:cs="Times New Roman"/>
@@ -37335,14 +37335,14 @@
         <w:spacing w:after="60" w:line="240" w:lineRule="auto"/>
         <w:ind w:left="567" w:hanging="567"/>
         <w:rPr>
-          <w:ins w:id="36469" w:author="Albert Kwame Osei-Owusu" w:date="2026-09-14T09:00:00Z"/>
+          <w:ins w:id="117874" w:author="Albert Kwame Osei-Owusu" w:date="2026-09-14T09:00:00Z"/>
           <w:rFonts w:ascii="Times New Roman" w:hAnsi="Times New Roman" w:cs="Times New Roman"/>
           <w:sz w:val="20"/>
           <w:szCs w:val="20"/>
           <w:lang w:val="en-GB"/>
         </w:rPr>
       </w:pPr>
-      <w:ins w:id="36470" w:author="Albert Kwame Osei-Owusu" w:date="2026-09-14T09:00:00Z">
+      <w:ins w:id="117875" w:author="Albert Kwame Osei-Owusu" w:date="2026-09-14T09:00:00Z">
         <w:r>
           <w:rPr>
             <w:rFonts w:ascii="Times New Roman" w:hAnsi="Times New Roman" w:cs="Times New Roman"/>
@@ -37372,7 +37372,7 @@
         </w:r>
       </w:ins>
       <w:hyperlink r:id="rIdRef30" w:history="1">
-        <w:ins w:id="36471" w:author="Albert Kwame Osei-Owusu" w:date="2026-09-14T09:00:00Z">
+        <w:ins w:id="117876" w:author="Albert Kwame Osei-Owusu" w:date="2026-09-14T09:00:00Z">
           <w:r>
             <w:rPr>
               <w:rStyle w:val="Hyperlink"/>
@@ -37385,7 +37385,7 @@
           </w:r>
         </w:ins>
       </w:hyperlink>
-      <w:ins w:id="36472" w:author="Albert Kwame Osei-Owusu" w:date="2026-09-14T09:00:00Z">
+      <w:ins w:id="117877" w:author="Albert Kwame Osei-Owusu" w:date="2026-09-14T09:00:00Z">
         <w:r>
           <w:rPr>
             <w:rFonts w:ascii="Times New Roman" w:hAnsi="Times New Roman" w:cs="Times New Roman"/>
@@ -37402,14 +37402,14 @@
         <w:spacing w:after="60" w:line="240" w:lineRule="auto"/>
         <w:ind w:left="567" w:hanging="567"/>
         <w:rPr>
-          <w:ins w:id="36473" w:author="Albert Kwame Osei-Owusu" w:date="2026-09-14T09:00:00Z"/>
+          <w:ins w:id="117878" w:author="Albert Kwame Osei-Owusu" w:date="2026-09-14T09:00:00Z"/>
           <w:rFonts w:ascii="Times New Roman" w:hAnsi="Times New Roman" w:cs="Times New Roman"/>
           <w:sz w:val="20"/>
           <w:szCs w:val="20"/>
           <w:lang w:val="en-GB"/>
         </w:rPr>
       </w:pPr>
-      <w:ins w:id="36474" w:author="Albert Kwame Osei-Owusu" w:date="2026-09-14T09:00:00Z">
+      <w:ins w:id="117879" w:author="Albert Kwame Osei-Owusu" w:date="2026-09-14T09:00:00Z">
         <w:r>
           <w:rPr>
             <w:rFonts w:ascii="Times New Roman" w:hAnsi="Times New Roman" w:cs="Times New Roman"/>
@@ -37439,7 +37439,7 @@
         </w:r>
       </w:ins>
       <w:hyperlink r:id="rIdRef31" w:history="1">
-        <w:ins w:id="36475" w:author="Albert Kwame Osei-Owusu" w:date="2026-09-14T09:00:00Z">
+        <w:ins w:id="117880" w:author="Albert Kwame Osei-Owusu" w:date="2026-09-14T09:00:00Z">
           <w:r>
             <w:rPr>
               <w:rStyle w:val="Hyperlink"/>
@@ -37452,7 +37452,7 @@
           </w:r>
         </w:ins>
       </w:hyperlink>
-      <w:ins w:id="36476" w:author="Albert Kwame Osei-Owusu" w:date="2026-09-14T09:00:00Z">
+      <w:ins w:id="117881" w:author="Albert Kwame Osei-Owusu" w:date="2026-09-14T09:00:00Z">
         <w:r>
           <w:rPr>
             <w:rFonts w:ascii="Times New Roman" w:hAnsi="Times New Roman" w:cs="Times New Roman"/>
@@ -37469,14 +37469,14 @@
         <w:spacing w:after="60" w:line="240" w:lineRule="auto"/>
         <w:ind w:left="567" w:hanging="567"/>
         <w:rPr>
-          <w:ins w:id="36477" w:author="Albert Kwame Osei-Owusu" w:date="2026-09-14T09:00:00Z"/>
+          <w:ins w:id="117882" w:author="Albert Kwame Osei-Owusu" w:date="2026-09-14T09:00:00Z"/>
           <w:rFonts w:ascii="Times New Roman" w:hAnsi="Times New Roman" w:cs="Times New Roman"/>
           <w:sz w:val="20"/>
           <w:szCs w:val="20"/>
           <w:lang w:val="en-GB"/>
         </w:rPr>
       </w:pPr>
-      <w:ins w:id="36478" w:author="Albert Kwame Osei-Owusu" w:date="2026-09-14T09:00:00Z">
+      <w:ins w:id="117883" w:author="Albert Kwame Osei-Owusu" w:date="2026-09-14T09:00:00Z">
         <w:r>
           <w:rPr>
             <w:rFonts w:ascii="Times New Roman" w:hAnsi="Times New Roman" w:cs="Times New Roman"/>
@@ -37506,7 +37506,7 @@
         </w:r>
       </w:ins>
       <w:hyperlink r:id="rIdRef32" w:history="1">
-        <w:ins w:id="36479" w:author="Albert Kwame Osei-Owusu" w:date="2026-09-14T09:00:00Z">
+        <w:ins w:id="117884" w:author="Albert Kwame Osei-Owusu" w:date="2026-09-14T09:00:00Z">
           <w:r>
             <w:rPr>
               <w:rStyle w:val="Hyperlink"/>
@@ -37519,7 +37519,7 @@
           </w:r>
         </w:ins>
       </w:hyperlink>
-      <w:ins w:id="36480" w:author="Albert Kwame Osei-Owusu" w:date="2026-09-14T09:00:00Z">
+      <w:ins w:id="117885" w:author="Albert Kwame Osei-Owusu" w:date="2026-09-14T09:00:00Z">
         <w:r>
           <w:rPr>
             <w:rFonts w:ascii="Times New Roman" w:hAnsi="Times New Roman" w:cs="Times New Roman"/>
@@ -37536,14 +37536,14 @@
         <w:spacing w:after="60" w:line="240" w:lineRule="auto"/>
         <w:ind w:left="567" w:hanging="567"/>
         <w:rPr>
-          <w:ins w:id="36481" w:author="Albert Kwame Osei-Owusu" w:date="2026-09-14T09:00:00Z"/>
+          <w:ins w:id="117886" w:author="Albert Kwame Osei-Owusu" w:date="2026-09-14T09:00:00Z"/>
           <w:rFonts w:ascii="Times New Roman" w:hAnsi="Times New Roman" w:cs="Times New Roman"/>
           <w:sz w:val="20"/>
           <w:szCs w:val="20"/>
           <w:lang w:val="en-GB"/>
         </w:rPr>
       </w:pPr>
-      <w:ins w:id="36482" w:author="Albert Kwame Osei-Owusu" w:date="2026-09-14T09:00:00Z">
+      <w:ins w:id="117887" w:author="Albert Kwame Osei-Owusu" w:date="2026-09-14T09:00:00Z">
         <w:r>
           <w:rPr>
             <w:rFonts w:ascii="Times New Roman" w:hAnsi="Times New Roman" w:cs="Times New Roman"/>
@@ -37573,7 +37573,7 @@
         </w:r>
       </w:ins>
       <w:hyperlink r:id="rIdRef33" w:history="1">
-        <w:ins w:id="36483" w:author="Albert Kwame Osei-Owusu" w:date="2026-09-14T09:00:00Z">
+        <w:ins w:id="117888" w:author="Albert Kwame Osei-Owusu" w:date="2026-09-14T09:00:00Z">
           <w:r>
             <w:rPr>
               <w:rStyle w:val="Hyperlink"/>
@@ -37586,7 +37586,7 @@
           </w:r>
         </w:ins>
       </w:hyperlink>
-      <w:ins w:id="36484" w:author="Albert Kwame Osei-Owusu" w:date="2026-09-14T09:00:00Z">
+      <w:ins w:id="117889" w:author="Albert Kwame Osei-Owusu" w:date="2026-09-14T09:00:00Z">
         <w:r>
           <w:rPr>
             <w:rFonts w:ascii="Times New Roman" w:hAnsi="Times New Roman" w:cs="Times New Roman"/>
@@ -37603,14 +37603,14 @@
         <w:spacing w:after="60" w:line="240" w:lineRule="auto"/>
         <w:ind w:left="567" w:hanging="567"/>
         <w:rPr>
-          <w:ins w:id="36485" w:author="Albert Kwame Osei-Owusu" w:date="2026-09-14T09:00:00Z"/>
+          <w:ins w:id="117890" w:author="Albert Kwame Osei-Owusu" w:date="2026-09-14T09:00:00Z"/>
           <w:rFonts w:ascii="Times New Roman" w:hAnsi="Times New Roman" w:cs="Times New Roman"/>
           <w:sz w:val="20"/>
           <w:szCs w:val="20"/>
           <w:lang w:val="en-GB"/>
         </w:rPr>
       </w:pPr>
-      <w:ins w:id="36486" w:author="Albert Kwame Osei-Owusu" w:date="2026-09-14T09:00:00Z">
+      <w:ins w:id="117891" w:author="Albert Kwame Osei-Owusu" w:date="2026-09-14T09:00:00Z">
         <w:r>
           <w:rPr>
             <w:rFonts w:ascii="Times New Roman" w:hAnsi="Times New Roman" w:cs="Times New Roman"/>
@@ -37636,11 +37636,145 @@
             <w:szCs w:val="20"/>
             <w:lang w:val="en-GB"/>
           </w:rPr>
+          <w:t xml:space="preserve">Eurostat, Greenhouse gas emission footprints (in CO2 equivalent, FIGARO application), env_ac_ghgfp [dataset], Eurostat, Luxembourg, 2026. </w:t>
+        </w:r>
+      </w:ins>
+      <w:hyperlink r:id="rIdRef34" w:history="1">
+        <w:ins w:id="117892" w:author="Albert Kwame Osei-Owusu" w:date="2026-09-14T09:00:00Z">
+          <w:r>
+            <w:rPr>
+              <w:rStyle w:val="Hyperlink"/>
+              <w:rFonts w:ascii="Times New Roman" w:hAnsi="Times New Roman" w:cs="Times New Roman"/>
+              <w:sz w:val="20"/>
+              <w:szCs w:val="20"/>
+              <w:lang w:val="en-GB"/>
+            </w:rPr>
+            <w:t xml:space="preserve">https://ec.europa.eu/eurostat/databrowser/view/env_ac_ghgfp/default/table</w:t>
+          </w:r>
+        </w:ins>
+      </w:hyperlink>
+      <w:ins w:id="117893" w:author="Albert Kwame Osei-Owusu" w:date="2026-09-14T09:00:00Z">
+        <w:r>
+          <w:rPr>
+            <w:rFonts w:ascii="Times New Roman" w:hAnsi="Times New Roman" w:cs="Times New Roman"/>
+            <w:sz w:val="20"/>
+            <w:szCs w:val="20"/>
+            <w:lang w:val="en-GB"/>
+          </w:rPr>
+          <w:t xml:space="preserve"> (accessed 7 September 2026).</w:t>
+        </w:r>
+      </w:ins>
+    </w:p>
+    <w:p>
+      <w:pPr>
+        <w:spacing w:after="60" w:line="240" w:lineRule="auto"/>
+        <w:ind w:left="567" w:hanging="567"/>
+        <w:rPr>
+          <w:ins w:id="117894" w:author="Albert Kwame Osei-Owusu" w:date="2026-09-14T09:00:00Z"/>
+          <w:rFonts w:ascii="Times New Roman" w:hAnsi="Times New Roman" w:cs="Times New Roman"/>
+          <w:sz w:val="20"/>
+          <w:szCs w:val="20"/>
+          <w:lang w:val="en-GB"/>
+        </w:rPr>
+      </w:pPr>
+      <w:ins w:id="117895" w:author="Albert Kwame Osei-Owusu" w:date="2026-09-14T09:00:00Z">
+        <w:r>
+          <w:rPr>
+            <w:rFonts w:ascii="Times New Roman" w:hAnsi="Times New Roman" w:cs="Times New Roman"/>
+            <w:sz w:val="20"/>
+            <w:szCs w:val="20"/>
+            <w:lang w:val="en-GB"/>
+          </w:rPr>
+          <w:t xml:space="preserve">[33]</w:t>
+        </w:r>
+        <w:r>
+          <w:rPr>
+            <w:rFonts w:ascii="Times New Roman" w:hAnsi="Times New Roman" w:cs="Times New Roman"/>
+            <w:sz w:val="20"/>
+            <w:szCs w:val="20"/>
+            <w:lang w:val="en-GB"/>
+          </w:rPr>
+          <w:tab/>
+        </w:r>
+        <w:r>
+          <w:rPr>
+            <w:rFonts w:ascii="Times New Roman" w:hAnsi="Times New Roman" w:cs="Times New Roman"/>
+            <w:sz w:val="20"/>
+            <w:szCs w:val="20"/>
+            <w:lang w:val="en-GB"/>
+          </w:rPr>
+          <w:t xml:space="preserve">Statistics Denmark, AFTRYK1: Climate footprint (experimental statistics) by type of use, emitting industries, emitting countries and time [dataset], StatBank Denmark, 2026. </w:t>
+        </w:r>
+      </w:ins>
+      <w:hyperlink r:id="rIdRef35" w:history="1">
+        <w:ins w:id="117896" w:author="Albert Kwame Osei-Owusu" w:date="2026-09-14T09:00:00Z">
+          <w:r>
+            <w:rPr>
+              <w:rStyle w:val="Hyperlink"/>
+              <w:rFonts w:ascii="Times New Roman" w:hAnsi="Times New Roman" w:cs="Times New Roman"/>
+              <w:sz w:val="20"/>
+              <w:szCs w:val="20"/>
+              <w:lang w:val="en-GB"/>
+            </w:rPr>
+            <w:t xml:space="preserve">https://www.statbank.dk/AFTRYK1</w:t>
+          </w:r>
+        </w:ins>
+      </w:hyperlink>
+      <w:ins w:id="117897" w:author="Albert Kwame Osei-Owusu" w:date="2026-09-14T09:00:00Z">
+        <w:r>
+          <w:rPr>
+            <w:rFonts w:ascii="Times New Roman" w:hAnsi="Times New Roman" w:cs="Times New Roman"/>
+            <w:sz w:val="20"/>
+            <w:szCs w:val="20"/>
+            <w:lang w:val="en-GB"/>
+          </w:rPr>
+          <w:t xml:space="preserve"> (accessed 14 September 2026).</w:t>
+        </w:r>
+      </w:ins>
+    </w:p>
+    <w:p>
+      <w:pPr>
+        <w:spacing w:after="60" w:line="240" w:lineRule="auto"/>
+        <w:ind w:left="567" w:hanging="567"/>
+        <w:rPr>
+          <w:ins w:id="117898" w:author="Albert Kwame Osei-Owusu" w:date="2026-09-14T09:00:00Z"/>
+          <w:rFonts w:ascii="Times New Roman" w:hAnsi="Times New Roman" w:cs="Times New Roman"/>
+          <w:sz w:val="20"/>
+          <w:szCs w:val="20"/>
+          <w:lang w:val="en-GB"/>
+        </w:rPr>
+      </w:pPr>
+      <w:ins w:id="117899" w:author="Albert Kwame Osei-Owusu" w:date="2026-09-14T09:00:00Z">
+        <w:r>
+          <w:rPr>
+            <w:rFonts w:ascii="Times New Roman" w:hAnsi="Times New Roman" w:cs="Times New Roman"/>
+            <w:sz w:val="20"/>
+            <w:szCs w:val="20"/>
+            <w:lang w:val="en-GB"/>
+          </w:rPr>
+          <w:t xml:space="preserve">[34]</w:t>
+        </w:r>
+        <w:r>
+          <w:rPr>
+            <w:rFonts w:ascii="Times New Roman" w:hAnsi="Times New Roman" w:cs="Times New Roman"/>
+            <w:sz w:val="20"/>
+            <w:szCs w:val="20"/>
+            <w:lang w:val="en-GB"/>
+          </w:rPr>
+          <w:tab/>
+        </w:r>
+        <w:r>
+          <w:rPr>
+            <w:rFonts w:ascii="Times New Roman" w:hAnsi="Times New Roman" w:cs="Times New Roman"/>
+            <w:sz w:val="20"/>
+            <w:szCs w:val="20"/>
+            <w:lang w:val="en-GB"/>
+          </w:rPr>
           <w:t xml:space="preserve">J. Schmidt, S. Merciai, Technical report: GHG emissions from Danish consumption 2016, causal link between consumption and GHG emissions, 2.-0 LCA consultants for CONCITO, Aalborg, 2023. </w:t>
         </w:r>
       </w:ins>
-      <w:hyperlink r:id="rIdRef34" w:history="1">
-        <w:ins w:id="36487" w:author="Albert Kwame Osei-Owusu" w:date="2026-09-14T09:00:00Z">
+      <w:hyperlink r:id="rIdRef36" w:history="1">
+        <w:ins w:id="117900" w:author="Albert Kwame Osei-Owusu" w:date="2026-09-14T09:00:00Z">
           <w:r>
             <w:rPr>
               <w:rStyle w:val="Hyperlink"/>
@@ -37653,7 +37787,7 @@
           </w:r>
         </w:ins>
       </w:hyperlink>
-      <w:ins w:id="36488" w:author="Albert Kwame Osei-Owusu" w:date="2026-09-14T09:00:00Z">
+      <w:ins w:id="117901" w:author="Albert Kwame Osei-Owusu" w:date="2026-09-14T09:00:00Z">
         <w:r>
           <w:rPr>
             <w:rFonts w:ascii="Times New Roman" w:hAnsi="Times New Roman" w:cs="Times New Roman"/>

</xml_diff>